<commit_message>
Better slides for Mock
</commit_message>
<xml_diff>
--- a/Labs/EG 04-Mock C#.docx
+++ b/Labs/EG 04-Mock C#.docx
@@ -88,7 +88,13 @@
         <w:t xml:space="preserve"> </w:t>
       </w:r>
       <w:r>
-        <w:t>Mocked Books database</w:t>
+        <w:t xml:space="preserve">Mocked </w:t>
+      </w:r>
+      <w:r>
+        <w:t xml:space="preserve">User </w:t>
+      </w:r>
+      <w:r>
+        <w:t>database</w:t>
       </w:r>
       <w:r>
         <w:t>.</w:t>
@@ -146,7 +152,10 @@
         <w:t>database</w:t>
       </w:r>
       <w:r>
-        <w:t xml:space="preserve"> of books</w:t>
+        <w:t xml:space="preserve"> of </w:t>
+      </w:r>
+      <w:r>
+        <w:t>users</w:t>
       </w:r>
       <w:r>
         <w:t>.</w:t>

</xml_diff>